<commit_message>
minor corrections in User Manual
</commit_message>
<xml_diff>
--- a/matlab_code/docs/GNSS_Fault_Injection_User_Manual.docx
+++ b/matlab_code/docs/GNSS_Fault_Injection_User_Manual.docx
@@ -12,28 +12,28 @@
     </w:p>
     <w:p>
       <w:r>
-        <w:t xml:space="preserve">Simple user </w:t>
-      </w:r>
-      <w:proofErr w:type="gramStart"/>
-      <w:r>
-        <w:t>manual  |</w:t>
-      </w:r>
-      <w:proofErr w:type="gramEnd"/>
-      <w:r>
-        <w:t xml:space="preserve">  injectOutliers.m </w:t>
+        <w:t xml:space="preserve">Simple user manual | </w:t>
+      </w:r>
+      <w:proofErr w:type="spellStart"/>
+      <w:r>
+        <w:t>injectOutliers.m</w:t>
+      </w:r>
+      <w:proofErr w:type="spellEnd"/>
+      <w:r>
+        <w:t xml:space="preserve"> </w:t>
       </w:r>
     </w:p>
     <w:p>
       <w:r>
         <w:t xml:space="preserve">Based on </w:t>
       </w:r>
-      <w:proofErr w:type="gramStart"/>
-      <w:r>
-        <w:t>injectOutliers(</w:t>
-      </w:r>
-      <w:proofErr w:type="gramEnd"/>
-      <w:r>
-        <w:t>6).m and configuration examples test_0, test_1, test_2 and test_3. This guide documents implemented behavior; limitations are highlighted where the code and example intent differ.</w:t>
+      <w:proofErr w:type="spellStart"/>
+      <w:r>
+        <w:t>injectOutliers.m</w:t>
+      </w:r>
+      <w:proofErr w:type="spellEnd"/>
+      <w:r>
+        <w:t xml:space="preserve"> and configuration examples test_0, test_1, test_2 and test_3. This guide documents implemented behavior; limitations are highlighted where the code and example intent differ.</w:t>
       </w:r>
     </w:p>
     <w:p>
@@ -1286,13 +1286,51 @@
         <w:spacing w:after="100"/>
         <w:ind w:left="245"/>
       </w:pPr>
+      <w:proofErr w:type="spellStart"/>
+      <w:proofErr w:type="gramStart"/>
       <w:r>
         <w:rPr>
           <w:rFonts w:ascii="Consolas" w:hAnsi="Consolas"/>
           <w:color w:val="244451"/>
           <w:sz w:val="16"/>
         </w:rPr>
-        <w:t>p.satelliteSelection.mode = 'random_sv_multi_constellation';</w:t>
+        <w:t>outlier.</w:t>
+      </w:r>
+      <w:r>
+        <w:rPr>
+          <w:rFonts w:ascii="Consolas" w:hAnsi="Consolas"/>
+          <w:color w:val="244451"/>
+          <w:sz w:val="16"/>
+        </w:rPr>
+        <w:t>satelliteSelection.mode</w:t>
+      </w:r>
+      <w:proofErr w:type="spellEnd"/>
+      <w:proofErr w:type="gramEnd"/>
+      <w:r>
+        <w:rPr>
+          <w:rFonts w:ascii="Consolas" w:hAnsi="Consolas"/>
+          <w:color w:val="244451"/>
+          <w:sz w:val="16"/>
+        </w:rPr>
+        <w:t xml:space="preserve"> = '</w:t>
+      </w:r>
+      <w:proofErr w:type="spellStart"/>
+      <w:r>
+        <w:rPr>
+          <w:rFonts w:ascii="Consolas" w:hAnsi="Consolas"/>
+          <w:color w:val="244451"/>
+          <w:sz w:val="16"/>
+        </w:rPr>
+        <w:t>random_sv_multi_constellation</w:t>
+      </w:r>
+      <w:proofErr w:type="spellEnd"/>
+      <w:r>
+        <w:rPr>
+          <w:rFonts w:ascii="Consolas" w:hAnsi="Consolas"/>
+          <w:color w:val="244451"/>
+          <w:sz w:val="16"/>
+        </w:rPr>
+        <w:t>';</w:t>
       </w:r>
       <w:r>
         <w:rPr>
@@ -1301,7 +1339,32 @@
           <w:sz w:val="16"/>
         </w:rPr>
         <w:br/>
-        <w:t>p.satelliteSelection.constellations = {'GPS','GAL'};</w:t>
+      </w:r>
+      <w:proofErr w:type="spellStart"/>
+      <w:r>
+        <w:rPr>
+          <w:rFonts w:ascii="Consolas" w:hAnsi="Consolas"/>
+          <w:color w:val="244451"/>
+          <w:sz w:val="16"/>
+        </w:rPr>
+        <w:t>outlier.</w:t>
+      </w:r>
+      <w:r>
+        <w:rPr>
+          <w:rFonts w:ascii="Consolas" w:hAnsi="Consolas"/>
+          <w:color w:val="244451"/>
+          <w:sz w:val="16"/>
+        </w:rPr>
+        <w:t>satelliteSelection.constellations</w:t>
+      </w:r>
+      <w:proofErr w:type="spellEnd"/>
+      <w:r>
+        <w:rPr>
+          <w:rFonts w:ascii="Consolas" w:hAnsi="Consolas"/>
+          <w:color w:val="244451"/>
+          <w:sz w:val="16"/>
+        </w:rPr>
+        <w:t xml:space="preserve"> = {'GPS','GAL'};</w:t>
       </w:r>
       <w:r>
         <w:rPr>
@@ -1310,12 +1373,61 @@
           <w:sz w:val="16"/>
         </w:rPr>
         <w:br/>
-        <w:t>p.satelliteSelection.nSatPerConstellation = [2 1];</w:t>
+      </w:r>
+      <w:proofErr w:type="spellStart"/>
+      <w:r>
+        <w:rPr>
+          <w:rFonts w:ascii="Consolas" w:hAnsi="Consolas"/>
+          <w:color w:val="244451"/>
+          <w:sz w:val="16"/>
+        </w:rPr>
+        <w:t>outlier.</w:t>
+      </w:r>
+      <w:r>
+        <w:rPr>
+          <w:rFonts w:ascii="Consolas" w:hAnsi="Consolas"/>
+          <w:color w:val="244451"/>
+          <w:sz w:val="16"/>
+        </w:rPr>
+        <w:t>satelliteSelection.nSatPerConstellation</w:t>
+      </w:r>
+      <w:proofErr w:type="spellEnd"/>
+      <w:r>
+        <w:rPr>
+          <w:rFonts w:ascii="Consolas" w:hAnsi="Consolas"/>
+          <w:color w:val="244451"/>
+          <w:sz w:val="16"/>
+        </w:rPr>
+        <w:t xml:space="preserve"> = [2 1];</w:t>
       </w:r>
     </w:p>
     <w:p>
       <w:r>
-        <w:t>For explicit selection, specify p.satelliteSelection.satIDs and p.satelliteSelection.constellations. Satellite IDs are not necessarily equal to pseudorange row indices. Random choices are fixed for the selected profile, except for the separate internal random selection in the noise helper.</w:t>
+        <w:t xml:space="preserve">For explicit selection, specify </w:t>
+      </w:r>
+      <w:proofErr w:type="spellStart"/>
+      <w:proofErr w:type="gramStart"/>
+      <w:r>
+        <w:t>outlier.</w:t>
+      </w:r>
+      <w:r>
+        <w:t>satelliteSelection.satIDs</w:t>
+      </w:r>
+      <w:proofErr w:type="spellEnd"/>
+      <w:proofErr w:type="gramEnd"/>
+      <w:r>
+        <w:t xml:space="preserve"> and </w:t>
+      </w:r>
+      <w:proofErr w:type="spellStart"/>
+      <w:r>
+        <w:t>outlier.</w:t>
+      </w:r>
+      <w:r>
+        <w:t>satelliteSelection.constellations</w:t>
+      </w:r>
+      <w:proofErr w:type="spellEnd"/>
+      <w:r>
+        <w:t>. Satellite IDs are not necessarily equal to pseudorange row indices. Random choices are fixed for the selected profile, except for the separate internal random selection in the noise helper.</w:t>
       </w:r>
     </w:p>
     <w:p>
@@ -1654,13 +1766,51 @@
         <w:spacing w:after="100"/>
         <w:ind w:left="245"/>
       </w:pPr>
+      <w:proofErr w:type="spellStart"/>
+      <w:proofErr w:type="gramStart"/>
       <w:r>
         <w:rPr>
           <w:rFonts w:ascii="Consolas" w:hAnsi="Consolas"/>
           <w:color w:val="244451"/>
           <w:sz w:val="16"/>
         </w:rPr>
-        <w:t>p.type = 'measurement_bias';</w:t>
+        <w:t>outlier.</w:t>
+      </w:r>
+      <w:r>
+        <w:rPr>
+          <w:rFonts w:ascii="Consolas" w:hAnsi="Consolas"/>
+          <w:color w:val="244451"/>
+          <w:sz w:val="16"/>
+        </w:rPr>
+        <w:t>type</w:t>
+      </w:r>
+      <w:proofErr w:type="spellEnd"/>
+      <w:proofErr w:type="gramEnd"/>
+      <w:r>
+        <w:rPr>
+          <w:rFonts w:ascii="Consolas" w:hAnsi="Consolas"/>
+          <w:color w:val="244451"/>
+          <w:sz w:val="16"/>
+        </w:rPr>
+        <w:t xml:space="preserve"> = '</w:t>
+      </w:r>
+      <w:proofErr w:type="spellStart"/>
+      <w:r>
+        <w:rPr>
+          <w:rFonts w:ascii="Consolas" w:hAnsi="Consolas"/>
+          <w:color w:val="244451"/>
+          <w:sz w:val="16"/>
+        </w:rPr>
+        <w:t>measurement_bias</w:t>
+      </w:r>
+      <w:proofErr w:type="spellEnd"/>
+      <w:r>
+        <w:rPr>
+          <w:rFonts w:ascii="Consolas" w:hAnsi="Consolas"/>
+          <w:color w:val="244451"/>
+          <w:sz w:val="16"/>
+        </w:rPr>
+        <w:t>';</w:t>
       </w:r>
       <w:r>
         <w:rPr>
@@ -1669,7 +1819,32 @@
           <w:sz w:val="16"/>
         </w:rPr>
         <w:br/>
-        <w:t>p.magnitudeType = 'ramp';</w:t>
+      </w:r>
+      <w:proofErr w:type="spellStart"/>
+      <w:r>
+        <w:rPr>
+          <w:rFonts w:ascii="Consolas" w:hAnsi="Consolas"/>
+          <w:color w:val="244451"/>
+          <w:sz w:val="16"/>
+        </w:rPr>
+        <w:t>outlier.</w:t>
+      </w:r>
+      <w:r>
+        <w:rPr>
+          <w:rFonts w:ascii="Consolas" w:hAnsi="Consolas"/>
+          <w:color w:val="244451"/>
+          <w:sz w:val="16"/>
+        </w:rPr>
+        <w:t>magnitudeType</w:t>
+      </w:r>
+      <w:proofErr w:type="spellEnd"/>
+      <w:r>
+        <w:rPr>
+          <w:rFonts w:ascii="Consolas" w:hAnsi="Consolas"/>
+          <w:color w:val="244451"/>
+          <w:sz w:val="16"/>
+        </w:rPr>
+        <w:t xml:space="preserve"> = 'ramp';</w:t>
       </w:r>
       <w:r>
         <w:rPr>
@@ -1678,8 +1853,43 @@
           <w:sz w:val="16"/>
         </w:rPr>
         <w:br/>
-        <w:t>p.magnitudeInitialValue = 5;   % metres</w:t>
-      </w:r>
+      </w:r>
+      <w:proofErr w:type="spellStart"/>
+      <w:r>
+        <w:rPr>
+          <w:rFonts w:ascii="Consolas" w:hAnsi="Consolas"/>
+          <w:color w:val="244451"/>
+          <w:sz w:val="16"/>
+        </w:rPr>
+        <w:t>outlier.</w:t>
+      </w:r>
+      <w:r>
+        <w:rPr>
+          <w:rFonts w:ascii="Consolas" w:hAnsi="Consolas"/>
+          <w:color w:val="244451"/>
+          <w:sz w:val="16"/>
+        </w:rPr>
+        <w:t>magnitudeInitialValue</w:t>
+      </w:r>
+      <w:proofErr w:type="spellEnd"/>
+      <w:r>
+        <w:rPr>
+          <w:rFonts w:ascii="Consolas" w:hAnsi="Consolas"/>
+          <w:color w:val="244451"/>
+          <w:sz w:val="16"/>
+        </w:rPr>
+        <w:t xml:space="preserve"> = 5;   % </w:t>
+      </w:r>
+      <w:proofErr w:type="spellStart"/>
+      <w:r>
+        <w:rPr>
+          <w:rFonts w:ascii="Consolas" w:hAnsi="Consolas"/>
+          <w:color w:val="244451"/>
+          <w:sz w:val="16"/>
+        </w:rPr>
+        <w:t>metres</w:t>
+      </w:r>
+      <w:proofErr w:type="spellEnd"/>
       <w:r>
         <w:rPr>
           <w:rFonts w:ascii="Consolas" w:hAnsi="Consolas"/>
@@ -1687,7 +1897,32 @@
           <w:sz w:val="16"/>
         </w:rPr>
         <w:br/>
-        <w:t>p.magnitudeSlope = 2;          % metres/second</w:t>
+      </w:r>
+      <w:proofErr w:type="spellStart"/>
+      <w:r>
+        <w:rPr>
+          <w:rFonts w:ascii="Consolas" w:hAnsi="Consolas"/>
+          <w:color w:val="244451"/>
+          <w:sz w:val="16"/>
+        </w:rPr>
+        <w:t>outlier.</w:t>
+      </w:r>
+      <w:r>
+        <w:rPr>
+          <w:rFonts w:ascii="Consolas" w:hAnsi="Consolas"/>
+          <w:color w:val="244451"/>
+          <w:sz w:val="16"/>
+        </w:rPr>
+        <w:t>magnitudeSlope</w:t>
+      </w:r>
+      <w:proofErr w:type="spellEnd"/>
+      <w:r>
+        <w:rPr>
+          <w:rFonts w:ascii="Consolas" w:hAnsi="Consolas"/>
+          <w:color w:val="244451"/>
+          <w:sz w:val="16"/>
+        </w:rPr>
+        <w:t xml:space="preserve"> = 2;          % metres/second</w:t>
       </w:r>
     </w:p>
     <w:p>
@@ -1716,13 +1951,51 @@
         <w:spacing w:after="100"/>
         <w:ind w:left="245"/>
       </w:pPr>
+      <w:proofErr w:type="spellStart"/>
+      <w:proofErr w:type="gramStart"/>
       <w:r>
         <w:rPr>
           <w:rFonts w:ascii="Consolas" w:hAnsi="Consolas"/>
           <w:color w:val="244451"/>
           <w:sz w:val="16"/>
         </w:rPr>
-        <w:t>p.type = 'clock_jump';</w:t>
+        <w:t>outlier.</w:t>
+      </w:r>
+      <w:r>
+        <w:rPr>
+          <w:rFonts w:ascii="Consolas" w:hAnsi="Consolas"/>
+          <w:color w:val="244451"/>
+          <w:sz w:val="16"/>
+        </w:rPr>
+        <w:t>type</w:t>
+      </w:r>
+      <w:proofErr w:type="spellEnd"/>
+      <w:proofErr w:type="gramEnd"/>
+      <w:r>
+        <w:rPr>
+          <w:rFonts w:ascii="Consolas" w:hAnsi="Consolas"/>
+          <w:color w:val="244451"/>
+          <w:sz w:val="16"/>
+        </w:rPr>
+        <w:t xml:space="preserve"> = '</w:t>
+      </w:r>
+      <w:proofErr w:type="spellStart"/>
+      <w:r>
+        <w:rPr>
+          <w:rFonts w:ascii="Consolas" w:hAnsi="Consolas"/>
+          <w:color w:val="244451"/>
+          <w:sz w:val="16"/>
+        </w:rPr>
+        <w:t>clock_jump</w:t>
+      </w:r>
+      <w:proofErr w:type="spellEnd"/>
+      <w:r>
+        <w:rPr>
+          <w:rFonts w:ascii="Consolas" w:hAnsi="Consolas"/>
+          <w:color w:val="244451"/>
+          <w:sz w:val="16"/>
+        </w:rPr>
+        <w:t>';</w:t>
       </w:r>
       <w:r>
         <w:rPr>
@@ -1731,7 +2004,58 @@
           <w:sz w:val="16"/>
         </w:rPr>
         <w:br/>
-        <w:t>p.startTime = 30; p.endTime = 35;</w:t>
+      </w:r>
+      <w:proofErr w:type="spellStart"/>
+      <w:r>
+        <w:rPr>
+          <w:rFonts w:ascii="Consolas" w:hAnsi="Consolas"/>
+          <w:color w:val="244451"/>
+          <w:sz w:val="16"/>
+        </w:rPr>
+        <w:t>outlier.</w:t>
+      </w:r>
+      <w:r>
+        <w:rPr>
+          <w:rFonts w:ascii="Consolas" w:hAnsi="Consolas"/>
+          <w:color w:val="244451"/>
+          <w:sz w:val="16"/>
+        </w:rPr>
+        <w:t>startTime</w:t>
+      </w:r>
+      <w:proofErr w:type="spellEnd"/>
+      <w:r>
+        <w:rPr>
+          <w:rFonts w:ascii="Consolas" w:hAnsi="Consolas"/>
+          <w:color w:val="244451"/>
+          <w:sz w:val="16"/>
+        </w:rPr>
+        <w:t xml:space="preserve"> = 30; </w:t>
+      </w:r>
+      <w:proofErr w:type="spellStart"/>
+      <w:r>
+        <w:rPr>
+          <w:rFonts w:ascii="Consolas" w:hAnsi="Consolas"/>
+          <w:color w:val="244451"/>
+          <w:sz w:val="16"/>
+        </w:rPr>
+        <w:t>outlier.</w:t>
+      </w:r>
+      <w:r>
+        <w:rPr>
+          <w:rFonts w:ascii="Consolas" w:hAnsi="Consolas"/>
+          <w:color w:val="244451"/>
+          <w:sz w:val="16"/>
+        </w:rPr>
+        <w:t>endTime</w:t>
+      </w:r>
+      <w:proofErr w:type="spellEnd"/>
+      <w:r>
+        <w:rPr>
+          <w:rFonts w:ascii="Consolas" w:hAnsi="Consolas"/>
+          <w:color w:val="244451"/>
+          <w:sz w:val="16"/>
+        </w:rPr>
+        <w:t xml:space="preserve"> = 35;</w:t>
       </w:r>
       <w:r>
         <w:rPr>
@@ -1740,7 +2064,50 @@
           <w:sz w:val="16"/>
         </w:rPr>
         <w:br/>
-        <w:t>p.satelliteSelection.mode = 'random_sv_selected_cons';</w:t>
+      </w:r>
+      <w:proofErr w:type="spellStart"/>
+      <w:r>
+        <w:rPr>
+          <w:rFonts w:ascii="Consolas" w:hAnsi="Consolas"/>
+          <w:color w:val="244451"/>
+          <w:sz w:val="16"/>
+        </w:rPr>
+        <w:t>outlier.</w:t>
+      </w:r>
+      <w:r>
+        <w:rPr>
+          <w:rFonts w:ascii="Consolas" w:hAnsi="Consolas"/>
+          <w:color w:val="244451"/>
+          <w:sz w:val="16"/>
+        </w:rPr>
+        <w:t>satelliteSelection.mode</w:t>
+      </w:r>
+      <w:proofErr w:type="spellEnd"/>
+      <w:r>
+        <w:rPr>
+          <w:rFonts w:ascii="Consolas" w:hAnsi="Consolas"/>
+          <w:color w:val="244451"/>
+          <w:sz w:val="16"/>
+        </w:rPr>
+        <w:t xml:space="preserve"> = '</w:t>
+      </w:r>
+      <w:proofErr w:type="spellStart"/>
+      <w:r>
+        <w:rPr>
+          <w:rFonts w:ascii="Consolas" w:hAnsi="Consolas"/>
+          <w:color w:val="244451"/>
+          <w:sz w:val="16"/>
+        </w:rPr>
+        <w:t>random_sv_selected_cons</w:t>
+      </w:r>
+      <w:proofErr w:type="spellEnd"/>
+      <w:r>
+        <w:rPr>
+          <w:rFonts w:ascii="Consolas" w:hAnsi="Consolas"/>
+          <w:color w:val="244451"/>
+          <w:sz w:val="16"/>
+        </w:rPr>
+        <w:t>';</w:t>
       </w:r>
       <w:r>
         <w:rPr>
@@ -1749,7 +2116,32 @@
           <w:sz w:val="16"/>
         </w:rPr>
         <w:br/>
-        <w:t>p.satelliteSelection.constellations = {'GAL'};</w:t>
+      </w:r>
+      <w:proofErr w:type="spellStart"/>
+      <w:r>
+        <w:rPr>
+          <w:rFonts w:ascii="Consolas" w:hAnsi="Consolas"/>
+          <w:color w:val="244451"/>
+          <w:sz w:val="16"/>
+        </w:rPr>
+        <w:t>outlier.</w:t>
+      </w:r>
+      <w:r>
+        <w:rPr>
+          <w:rFonts w:ascii="Consolas" w:hAnsi="Consolas"/>
+          <w:color w:val="244451"/>
+          <w:sz w:val="16"/>
+        </w:rPr>
+        <w:t>satelliteSelection.constellations</w:t>
+      </w:r>
+      <w:proofErr w:type="spellEnd"/>
+      <w:r>
+        <w:rPr>
+          <w:rFonts w:ascii="Consolas" w:hAnsi="Consolas"/>
+          <w:color w:val="244451"/>
+          <w:sz w:val="16"/>
+        </w:rPr>
+        <w:t xml:space="preserve"> = {'GAL'};</w:t>
       </w:r>
       <w:r>
         <w:rPr>
@@ -1758,7 +2150,32 @@
           <w:sz w:val="16"/>
         </w:rPr>
         <w:br/>
-        <w:t>p.satelliteSelection.nSat = 3;</w:t>
+      </w:r>
+      <w:proofErr w:type="spellStart"/>
+      <w:r>
+        <w:rPr>
+          <w:rFonts w:ascii="Consolas" w:hAnsi="Consolas"/>
+          <w:color w:val="244451"/>
+          <w:sz w:val="16"/>
+        </w:rPr>
+        <w:t>outlier.</w:t>
+      </w:r>
+      <w:r>
+        <w:rPr>
+          <w:rFonts w:ascii="Consolas" w:hAnsi="Consolas"/>
+          <w:color w:val="244451"/>
+          <w:sz w:val="16"/>
+        </w:rPr>
+        <w:t>satelliteSelection.nSat</w:t>
+      </w:r>
+      <w:proofErr w:type="spellEnd"/>
+      <w:r>
+        <w:rPr>
+          <w:rFonts w:ascii="Consolas" w:hAnsi="Consolas"/>
+          <w:color w:val="244451"/>
+          <w:sz w:val="16"/>
+        </w:rPr>
+        <w:t xml:space="preserve"> = 3;</w:t>
       </w:r>
       <w:r>
         <w:rPr>
@@ -1767,7 +2184,32 @@
           <w:sz w:val="16"/>
         </w:rPr>
         <w:br/>
-        <w:t>p.clockJump = 10;    % metres</w:t>
+      </w:r>
+      <w:proofErr w:type="spellStart"/>
+      <w:r>
+        <w:rPr>
+          <w:rFonts w:ascii="Consolas" w:hAnsi="Consolas"/>
+          <w:color w:val="244451"/>
+          <w:sz w:val="16"/>
+        </w:rPr>
+        <w:t>outlier.</w:t>
+      </w:r>
+      <w:r>
+        <w:rPr>
+          <w:rFonts w:ascii="Consolas" w:hAnsi="Consolas"/>
+          <w:color w:val="244451"/>
+          <w:sz w:val="16"/>
+        </w:rPr>
+        <w:t>clockJump</w:t>
+      </w:r>
+      <w:proofErr w:type="spellEnd"/>
+      <w:r>
+        <w:rPr>
+          <w:rFonts w:ascii="Consolas" w:hAnsi="Consolas"/>
+          <w:color w:val="244451"/>
+          <w:sz w:val="16"/>
+        </w:rPr>
+        <w:t xml:space="preserve"> = 10;    % metres</w:t>
       </w:r>
     </w:p>
     <w:p>
@@ -1789,13 +2231,51 @@
         <w:spacing w:after="100"/>
         <w:ind w:left="245"/>
       </w:pPr>
+      <w:proofErr w:type="spellStart"/>
+      <w:proofErr w:type="gramStart"/>
       <w:r>
         <w:rPr>
           <w:rFonts w:ascii="Consolas" w:hAnsi="Consolas"/>
           <w:color w:val="244451"/>
           <w:sz w:val="16"/>
         </w:rPr>
-        <w:t>p.type = 'ephemeris_error';</w:t>
+        <w:t>outlier.</w:t>
+      </w:r>
+      <w:r>
+        <w:rPr>
+          <w:rFonts w:ascii="Consolas" w:hAnsi="Consolas"/>
+          <w:color w:val="244451"/>
+          <w:sz w:val="16"/>
+        </w:rPr>
+        <w:t>type</w:t>
+      </w:r>
+      <w:proofErr w:type="spellEnd"/>
+      <w:proofErr w:type="gramEnd"/>
+      <w:r>
+        <w:rPr>
+          <w:rFonts w:ascii="Consolas" w:hAnsi="Consolas"/>
+          <w:color w:val="244451"/>
+          <w:sz w:val="16"/>
+        </w:rPr>
+        <w:t xml:space="preserve"> = '</w:t>
+      </w:r>
+      <w:proofErr w:type="spellStart"/>
+      <w:r>
+        <w:rPr>
+          <w:rFonts w:ascii="Consolas" w:hAnsi="Consolas"/>
+          <w:color w:val="244451"/>
+          <w:sz w:val="16"/>
+        </w:rPr>
+        <w:t>ephemeris_error</w:t>
+      </w:r>
+      <w:proofErr w:type="spellEnd"/>
+      <w:r>
+        <w:rPr>
+          <w:rFonts w:ascii="Consolas" w:hAnsi="Consolas"/>
+          <w:color w:val="244451"/>
+          <w:sz w:val="16"/>
+        </w:rPr>
+        <w:t>';</w:t>
       </w:r>
       <w:r>
         <w:rPr>
@@ -1804,7 +2284,32 @@
           <w:sz w:val="16"/>
         </w:rPr>
         <w:br/>
-        <w:t>p.satelliteSelection.mode = 'explicit';</w:t>
+      </w:r>
+      <w:proofErr w:type="spellStart"/>
+      <w:r>
+        <w:rPr>
+          <w:rFonts w:ascii="Consolas" w:hAnsi="Consolas"/>
+          <w:color w:val="244451"/>
+          <w:sz w:val="16"/>
+        </w:rPr>
+        <w:t>outlier.</w:t>
+      </w:r>
+      <w:r>
+        <w:rPr>
+          <w:rFonts w:ascii="Consolas" w:hAnsi="Consolas"/>
+          <w:color w:val="244451"/>
+          <w:sz w:val="16"/>
+        </w:rPr>
+        <w:t>satelliteSelection.mode</w:t>
+      </w:r>
+      <w:proofErr w:type="spellEnd"/>
+      <w:r>
+        <w:rPr>
+          <w:rFonts w:ascii="Consolas" w:hAnsi="Consolas"/>
+          <w:color w:val="244451"/>
+          <w:sz w:val="16"/>
+        </w:rPr>
+        <w:t xml:space="preserve"> = 'explicit';</w:t>
       </w:r>
       <w:r>
         <w:rPr>
@@ -1813,7 +2318,32 @@
           <w:sz w:val="16"/>
         </w:rPr>
         <w:br/>
-        <w:t>p.satelliteSelection.constellations = {'GPS'};</w:t>
+      </w:r>
+      <w:proofErr w:type="spellStart"/>
+      <w:r>
+        <w:rPr>
+          <w:rFonts w:ascii="Consolas" w:hAnsi="Consolas"/>
+          <w:color w:val="244451"/>
+          <w:sz w:val="16"/>
+        </w:rPr>
+        <w:t>outlier.</w:t>
+      </w:r>
+      <w:r>
+        <w:rPr>
+          <w:rFonts w:ascii="Consolas" w:hAnsi="Consolas"/>
+          <w:color w:val="244451"/>
+          <w:sz w:val="16"/>
+        </w:rPr>
+        <w:t>satelliteSelection.constellations</w:t>
+      </w:r>
+      <w:proofErr w:type="spellEnd"/>
+      <w:r>
+        <w:rPr>
+          <w:rFonts w:ascii="Consolas" w:hAnsi="Consolas"/>
+          <w:color w:val="244451"/>
+          <w:sz w:val="16"/>
+        </w:rPr>
+        <w:t xml:space="preserve"> = {'GPS'};</w:t>
       </w:r>
       <w:r>
         <w:rPr>
@@ -1822,7 +2352,32 @@
           <w:sz w:val="16"/>
         </w:rPr>
         <w:br/>
-        <w:t>p.satelliteSelection.satIDs = [2 4 30];</w:t>
+      </w:r>
+      <w:proofErr w:type="spellStart"/>
+      <w:r>
+        <w:rPr>
+          <w:rFonts w:ascii="Consolas" w:hAnsi="Consolas"/>
+          <w:color w:val="244451"/>
+          <w:sz w:val="16"/>
+        </w:rPr>
+        <w:t>outlier.</w:t>
+      </w:r>
+      <w:r>
+        <w:rPr>
+          <w:rFonts w:ascii="Consolas" w:hAnsi="Consolas"/>
+          <w:color w:val="244451"/>
+          <w:sz w:val="16"/>
+        </w:rPr>
+        <w:t>satelliteSelection.satIDs</w:t>
+      </w:r>
+      <w:proofErr w:type="spellEnd"/>
+      <w:r>
+        <w:rPr>
+          <w:rFonts w:ascii="Consolas" w:hAnsi="Consolas"/>
+          <w:color w:val="244451"/>
+          <w:sz w:val="16"/>
+        </w:rPr>
+        <w:t xml:space="preserve"> = [2 4 30];</w:t>
       </w:r>
       <w:r>
         <w:rPr>
@@ -1831,7 +2386,32 @@
           <w:sz w:val="16"/>
         </w:rPr>
         <w:br/>
-        <w:t>p.ephemerisError = [10 10 5]; % ENU metres</w:t>
+      </w:r>
+      <w:proofErr w:type="spellStart"/>
+      <w:r>
+        <w:rPr>
+          <w:rFonts w:ascii="Consolas" w:hAnsi="Consolas"/>
+          <w:color w:val="244451"/>
+          <w:sz w:val="16"/>
+        </w:rPr>
+        <w:t>outlier.</w:t>
+      </w:r>
+      <w:r>
+        <w:rPr>
+          <w:rFonts w:ascii="Consolas" w:hAnsi="Consolas"/>
+          <w:color w:val="244451"/>
+          <w:sz w:val="16"/>
+        </w:rPr>
+        <w:t>ephemerisError</w:t>
+      </w:r>
+      <w:proofErr w:type="spellEnd"/>
+      <w:r>
+        <w:rPr>
+          <w:rFonts w:ascii="Consolas" w:hAnsi="Consolas"/>
+          <w:color w:val="244451"/>
+          <w:sz w:val="16"/>
+        </w:rPr>
+        <w:t xml:space="preserve"> = [10 10 5]; % ENU metres</w:t>
       </w:r>
     </w:p>
     <w:p>
@@ -1871,13 +2451,33 @@
         <w:spacing w:after="100"/>
         <w:ind w:left="245"/>
       </w:pPr>
+      <w:proofErr w:type="spellStart"/>
+      <w:proofErr w:type="gramStart"/>
       <w:r>
         <w:rPr>
           <w:rFonts w:ascii="Consolas" w:hAnsi="Consolas"/>
           <w:color w:val="244451"/>
           <w:sz w:val="16"/>
         </w:rPr>
-        <w:t>p.type = 'noise';</w:t>
+        <w:t>outlier.</w:t>
+      </w:r>
+      <w:r>
+        <w:rPr>
+          <w:rFonts w:ascii="Consolas" w:hAnsi="Consolas"/>
+          <w:color w:val="244451"/>
+          <w:sz w:val="16"/>
+        </w:rPr>
+        <w:t>type</w:t>
+      </w:r>
+      <w:proofErr w:type="spellEnd"/>
+      <w:proofErr w:type="gramEnd"/>
+      <w:r>
+        <w:rPr>
+          <w:rFonts w:ascii="Consolas" w:hAnsi="Consolas"/>
+          <w:color w:val="244451"/>
+          <w:sz w:val="16"/>
+        </w:rPr>
+        <w:t xml:space="preserve"> = 'noise';</w:t>
       </w:r>
       <w:r>
         <w:rPr>
@@ -1886,7 +2486,58 @@
           <w:sz w:val="16"/>
         </w:rPr>
         <w:br/>
-        <w:t>p.startTime = 10; p.endTime = 15;</w:t>
+      </w:r>
+      <w:proofErr w:type="spellStart"/>
+      <w:r>
+        <w:rPr>
+          <w:rFonts w:ascii="Consolas" w:hAnsi="Consolas"/>
+          <w:color w:val="244451"/>
+          <w:sz w:val="16"/>
+        </w:rPr>
+        <w:t>outlier.</w:t>
+      </w:r>
+      <w:r>
+        <w:rPr>
+          <w:rFonts w:ascii="Consolas" w:hAnsi="Consolas"/>
+          <w:color w:val="244451"/>
+          <w:sz w:val="16"/>
+        </w:rPr>
+        <w:t>startTime</w:t>
+      </w:r>
+      <w:proofErr w:type="spellEnd"/>
+      <w:r>
+        <w:rPr>
+          <w:rFonts w:ascii="Consolas" w:hAnsi="Consolas"/>
+          <w:color w:val="244451"/>
+          <w:sz w:val="16"/>
+        </w:rPr>
+        <w:t xml:space="preserve"> = 10; </w:t>
+      </w:r>
+      <w:proofErr w:type="spellStart"/>
+      <w:r>
+        <w:rPr>
+          <w:rFonts w:ascii="Consolas" w:hAnsi="Consolas"/>
+          <w:color w:val="244451"/>
+          <w:sz w:val="16"/>
+        </w:rPr>
+        <w:t>outlier.</w:t>
+      </w:r>
+      <w:r>
+        <w:rPr>
+          <w:rFonts w:ascii="Consolas" w:hAnsi="Consolas"/>
+          <w:color w:val="244451"/>
+          <w:sz w:val="16"/>
+        </w:rPr>
+        <w:t>endTime</w:t>
+      </w:r>
+      <w:proofErr w:type="spellEnd"/>
+      <w:r>
+        <w:rPr>
+          <w:rFonts w:ascii="Consolas" w:hAnsi="Consolas"/>
+          <w:color w:val="244451"/>
+          <w:sz w:val="16"/>
+        </w:rPr>
+        <w:t xml:space="preserve"> = 15;</w:t>
       </w:r>
       <w:r>
         <w:rPr>
@@ -1895,7 +2546,32 @@
           <w:sz w:val="16"/>
         </w:rPr>
         <w:br/>
-        <w:t>p.satelliteSelection.mode = 'fraction';</w:t>
+      </w:r>
+      <w:proofErr w:type="spellStart"/>
+      <w:r>
+        <w:rPr>
+          <w:rFonts w:ascii="Consolas" w:hAnsi="Consolas"/>
+          <w:color w:val="244451"/>
+          <w:sz w:val="16"/>
+        </w:rPr>
+        <w:t>outlier.</w:t>
+      </w:r>
+      <w:r>
+        <w:rPr>
+          <w:rFonts w:ascii="Consolas" w:hAnsi="Consolas"/>
+          <w:color w:val="244451"/>
+          <w:sz w:val="16"/>
+        </w:rPr>
+        <w:t>satelliteSelection.mode</w:t>
+      </w:r>
+      <w:proofErr w:type="spellEnd"/>
+      <w:r>
+        <w:rPr>
+          <w:rFonts w:ascii="Consolas" w:hAnsi="Consolas"/>
+          <w:color w:val="244451"/>
+          <w:sz w:val="16"/>
+        </w:rPr>
+        <w:t xml:space="preserve"> = 'fraction';</w:t>
       </w:r>
       <w:r>
         <w:rPr>
@@ -1904,7 +2580,32 @@
           <w:sz w:val="16"/>
         </w:rPr>
         <w:br/>
-        <w:t>p.satelliteSelection.fraction = 0.2;</w:t>
+      </w:r>
+      <w:proofErr w:type="spellStart"/>
+      <w:r>
+        <w:rPr>
+          <w:rFonts w:ascii="Consolas" w:hAnsi="Consolas"/>
+          <w:color w:val="244451"/>
+          <w:sz w:val="16"/>
+        </w:rPr>
+        <w:t>outlier.</w:t>
+      </w:r>
+      <w:r>
+        <w:rPr>
+          <w:rFonts w:ascii="Consolas" w:hAnsi="Consolas"/>
+          <w:color w:val="244451"/>
+          <w:sz w:val="16"/>
+        </w:rPr>
+        <w:t>satelliteSelection.fraction</w:t>
+      </w:r>
+      <w:proofErr w:type="spellEnd"/>
+      <w:r>
+        <w:rPr>
+          <w:rFonts w:ascii="Consolas" w:hAnsi="Consolas"/>
+          <w:color w:val="244451"/>
+          <w:sz w:val="16"/>
+        </w:rPr>
+        <w:t xml:space="preserve"> = 0.2;</w:t>
       </w:r>
       <w:r>
         <w:rPr>
@@ -1913,7 +2614,32 @@
           <w:sz w:val="16"/>
         </w:rPr>
         <w:br/>
-        <w:t>p.noise.model = 'gaussian';</w:t>
+      </w:r>
+      <w:proofErr w:type="spellStart"/>
+      <w:r>
+        <w:rPr>
+          <w:rFonts w:ascii="Consolas" w:hAnsi="Consolas"/>
+          <w:color w:val="244451"/>
+          <w:sz w:val="16"/>
+        </w:rPr>
+        <w:t>outlier.</w:t>
+      </w:r>
+      <w:r>
+        <w:rPr>
+          <w:rFonts w:ascii="Consolas" w:hAnsi="Consolas"/>
+          <w:color w:val="244451"/>
+          <w:sz w:val="16"/>
+        </w:rPr>
+        <w:t>noise.model</w:t>
+      </w:r>
+      <w:proofErr w:type="spellEnd"/>
+      <w:r>
+        <w:rPr>
+          <w:rFonts w:ascii="Consolas" w:hAnsi="Consolas"/>
+          <w:color w:val="244451"/>
+          <w:sz w:val="16"/>
+        </w:rPr>
+        <w:t xml:space="preserve"> = 'gaussian';</w:t>
       </w:r>
       <w:r>
         <w:rPr>
@@ -1922,7 +2648,32 @@
           <w:sz w:val="16"/>
         </w:rPr>
         <w:br/>
-        <w:t>p.noise.scale = 10;</w:t>
+      </w:r>
+      <w:proofErr w:type="spellStart"/>
+      <w:r>
+        <w:rPr>
+          <w:rFonts w:ascii="Consolas" w:hAnsi="Consolas"/>
+          <w:color w:val="244451"/>
+          <w:sz w:val="16"/>
+        </w:rPr>
+        <w:t>outlier.</w:t>
+      </w:r>
+      <w:r>
+        <w:rPr>
+          <w:rFonts w:ascii="Consolas" w:hAnsi="Consolas"/>
+          <w:color w:val="244451"/>
+          <w:sz w:val="16"/>
+        </w:rPr>
+        <w:t>noise.scale</w:t>
+      </w:r>
+      <w:proofErr w:type="spellEnd"/>
+      <w:r>
+        <w:rPr>
+          <w:rFonts w:ascii="Consolas" w:hAnsi="Consolas"/>
+          <w:color w:val="244451"/>
+          <w:sz w:val="16"/>
+        </w:rPr>
+        <w:t xml:space="preserve"> = 10;</w:t>
       </w:r>
       <w:r>
         <w:rPr>
@@ -1931,7 +2682,32 @@
           <w:sz w:val="16"/>
         </w:rPr>
         <w:br/>
-        <w:t>p.noise.mean = 10;</w:t>
+      </w:r>
+      <w:proofErr w:type="spellStart"/>
+      <w:r>
+        <w:rPr>
+          <w:rFonts w:ascii="Consolas" w:hAnsi="Consolas"/>
+          <w:color w:val="244451"/>
+          <w:sz w:val="16"/>
+        </w:rPr>
+        <w:t>outlier.</w:t>
+      </w:r>
+      <w:r>
+        <w:rPr>
+          <w:rFonts w:ascii="Consolas" w:hAnsi="Consolas"/>
+          <w:color w:val="244451"/>
+          <w:sz w:val="16"/>
+        </w:rPr>
+        <w:t>noise.mean</w:t>
+      </w:r>
+      <w:proofErr w:type="spellEnd"/>
+      <w:r>
+        <w:rPr>
+          <w:rFonts w:ascii="Consolas" w:hAnsi="Consolas"/>
+          <w:color w:val="244451"/>
+          <w:sz w:val="16"/>
+        </w:rPr>
+        <w:t xml:space="preserve"> = 10;</w:t>
       </w:r>
     </w:p>
     <w:p>
@@ -2377,10 +3153,7 @@
       <w:jc w:val="center"/>
     </w:pPr>
     <w:r>
-      <w:t xml:space="preserve">GNSS Fault Injection </w:t>
-    </w:r>
-    <w:r>
-      <w:t xml:space="preserve">• </w:t>
+      <w:t xml:space="preserve">GNSS Fault Injection • </w:t>
     </w:r>
     <w:r>
       <w:t>U</w:t>

</xml_diff>